<commit_message>
Lab 3: Add TaskForm with React Hook Form and Zod validation
</commit_message>
<xml_diff>
--- a/інтернет-програмування/Драч_ЛР№3_Звіт.docx
+++ b/інтернет-програмування/Драч_ЛР№3_Звіт.docx
@@ -20310,6 +20310,74 @@
           <w:szCs w:val="28"/>
         </w:rPr>
       </w:pPr>
+    </w:p>
+    <w:p>
+      <w:pPr>
+        <w:spacing w:after="0"/>
+        <w:rPr>
+          <w:sz w:val="28"/>
+          <w:szCs w:val="28"/>
+          <w:lang w:val="uk-UA"/>
+        </w:rPr>
+      </w:pPr>
+      <w:r>
+        <w:rPr>
+          <w:sz w:val="28"/>
+          <w:szCs w:val="28"/>
+          <w:lang w:val="uk-UA"/>
+        </w:rPr>
+        <w:t>Зафіксував зміни:</w:t>
+      </w:r>
+    </w:p>
+    <w:p>
+      <w:pPr>
+        <w:spacing w:after="0"/>
+        <w:rPr>
+          <w:sz w:val="28"/>
+          <w:szCs w:val="28"/>
+          <w:lang w:val="en-US"/>
+        </w:rPr>
+      </w:pPr>
+      <w:r>
+        <w:rPr>
+          <w:noProof/>
+        </w:rPr>
+        <w:drawing>
+          <wp:inline distT="0" distB="0" distL="0" distR="0" wp14:anchorId="512C9A42" wp14:editId="3726B716">
+            <wp:extent cx="4448175" cy="1933575"/>
+            <wp:effectExtent l="0" t="0" r="9525" b="9525"/>
+            <wp:docPr id="19" name="Рисунок 19"/>
+            <wp:cNvGraphicFramePr>
+              <a:graphicFrameLocks xmlns:a="http://schemas.openxmlformats.org/drawingml/2006/main" noChangeAspect="1"/>
+            </wp:cNvGraphicFramePr>
+            <a:graphic xmlns:a="http://schemas.openxmlformats.org/drawingml/2006/main">
+              <a:graphicData uri="http://schemas.openxmlformats.org/drawingml/2006/picture">
+                <pic:pic xmlns:pic="http://schemas.openxmlformats.org/drawingml/2006/picture">
+                  <pic:nvPicPr>
+                    <pic:cNvPr id="1" name=""/>
+                    <pic:cNvPicPr/>
+                  </pic:nvPicPr>
+                  <pic:blipFill>
+                    <a:blip r:embed="rId22"/>
+                    <a:stretch>
+                      <a:fillRect/>
+                    </a:stretch>
+                  </pic:blipFill>
+                  <pic:spPr>
+                    <a:xfrm>
+                      <a:off x="0" y="0"/>
+                      <a:ext cx="4448175" cy="1933575"/>
+                    </a:xfrm>
+                    <a:prstGeom prst="rect">
+                      <a:avLst/>
+                    </a:prstGeom>
+                  </pic:spPr>
+                </pic:pic>
+              </a:graphicData>
+            </a:graphic>
+          </wp:inline>
+        </w:drawing>
+      </w:r>
     </w:p>
     <w:p>
       <w:pPr>

</xml_diff>